<commit_message>
fix: implementar DocxTemplate nativo para preservar formato, espacios y guiones en las plantillas
</commit_message>
<xml_diff>
--- a/backend/templates/EDOMEX_AP_M_SOLTERA.docx
+++ b/backend/templates/EDOMEX_AP_M_SOLTERA.docx
@@ -549,7 +549,6 @@
         </w:rPr>
         <w:t xml:space="preserve">A FAVOR DE LA SEÑORA </w:t>
       </w:r>
-      <w:proofErr w:type="gramStart"/>
       <w:r>
         <w:rPr>
           <w:rFonts w:ascii="Arial" w:hAnsi="Arial" w:cs="Arial"/>
@@ -558,62 +557,7 @@
           <w:szCs w:val="14"/>
           <w:lang w:val="es-MX"/>
         </w:rPr>
-        <w:t xml:space="preserve">{{ </w:t>
-      </w:r>
-      <w:proofErr w:type="spellStart"/>
-      <w:r>
-        <w:rPr>
-          <w:rFonts w:ascii="Arial" w:hAnsi="Arial" w:cs="Arial"/>
-          <w:b/>
-          <w:sz w:val="14"/>
-          <w:szCs w:val="14"/>
-          <w:lang w:val="es-MX"/>
-        </w:rPr>
-        <w:t>nombre</w:t>
-      </w:r>
-      <w:proofErr w:type="gramEnd"/>
-      <w:r>
-        <w:rPr>
-          <w:rFonts w:ascii="Arial" w:hAnsi="Arial" w:cs="Arial"/>
-          <w:b/>
-          <w:sz w:val="14"/>
-          <w:szCs w:val="14"/>
-          <w:lang w:val="es-MX"/>
-        </w:rPr>
-        <w:t>_</w:t>
-      </w:r>
-      <w:proofErr w:type="gramStart"/>
-      <w:r>
-        <w:rPr>
-          <w:rFonts w:ascii="Arial" w:hAnsi="Arial" w:cs="Arial"/>
-          <w:b/>
-          <w:sz w:val="14"/>
-          <w:szCs w:val="14"/>
-          <w:lang w:val="es-MX"/>
-        </w:rPr>
-        <w:t>acreditado</w:t>
-      </w:r>
-      <w:proofErr w:type="spellEnd"/>
-      <w:r>
-        <w:rPr>
-          <w:rFonts w:ascii="Arial" w:hAnsi="Arial" w:cs="Arial"/>
-          <w:b/>
-          <w:sz w:val="14"/>
-          <w:szCs w:val="14"/>
-          <w:lang w:val="es-MX"/>
-        </w:rPr>
-        <w:t xml:space="preserve"> }</w:t>
-      </w:r>
-      <w:proofErr w:type="gramEnd"/>
-      <w:r>
-        <w:rPr>
-          <w:rFonts w:ascii="Arial" w:hAnsi="Arial" w:cs="Arial"/>
-          <w:b/>
-          <w:sz w:val="14"/>
-          <w:szCs w:val="14"/>
-          <w:lang w:val="es-MX"/>
-        </w:rPr>
-        <w:t>}</w:t>
+        <w:t>{{ nombre_acreditado }}</w:t>
       </w:r>
       <w:r>
         <w:rPr>
@@ -1455,605 +1399,496 @@
           <w:szCs w:val="14"/>
           <w:lang w:val="es-MX"/>
         </w:rPr>
+        <w:t>{{ numero_</w:t>
+      </w:r>
+      <w:r>
+        <w:rPr>
+          <w:rFonts w:ascii="Arial" w:eastAsia="Batang" w:hAnsi="Arial" w:cs="Arial"/>
+          <w:b/>
+          <w:bCs/>
+          <w:sz w:val="14"/>
+          <w:szCs w:val="14"/>
+          <w:lang w:val="es-MX"/>
+        </w:rPr>
+        <w:t>escritura</w:t>
+      </w:r>
+      <w:r>
+        <w:rPr>
+          <w:rFonts w:ascii="Arial" w:eastAsia="Batang" w:hAnsi="Arial" w:cs="Arial"/>
+          <w:b/>
+          <w:bCs/>
+          <w:sz w:val="14"/>
+          <w:szCs w:val="14"/>
+          <w:lang w:val="es-MX"/>
+        </w:rPr>
+        <w:t xml:space="preserve"> }}</w:t>
+      </w:r>
+      <w:r>
+        <w:rPr>
+          <w:rFonts w:ascii="Arial" w:eastAsia="Batang" w:hAnsi="Arial" w:cs="Arial"/>
+          <w:sz w:val="14"/>
+          <w:szCs w:val="14"/>
+        </w:rPr>
+        <w:t>,</w:t>
+      </w:r>
+      <w:r>
+        <w:rPr>
+          <w:rFonts w:ascii="Arial" w:eastAsia="Batang" w:hAnsi="Arial" w:cs="Arial"/>
+          <w:sz w:val="14"/>
+          <w:szCs w:val="14"/>
+        </w:rPr>
+        <w:t xml:space="preserve"> </w:t>
+      </w:r>
+      <w:r>
+        <w:rPr>
+          <w:rFonts w:ascii="Arial" w:eastAsia="Batang" w:hAnsi="Arial" w:cs="Arial"/>
+          <w:sz w:val="14"/>
+          <w:szCs w:val="14"/>
+        </w:rPr>
+        <w:t>de fecha</w:t>
+      </w:r>
+      <w:r>
+        <w:rPr>
+          <w:rFonts w:ascii="Arial" w:eastAsia="Batang" w:hAnsi="Arial" w:cs="Arial"/>
+          <w:sz w:val="14"/>
+          <w:szCs w:val="14"/>
+        </w:rPr>
+        <w:t xml:space="preserve"> </w:t>
+      </w:r>
+      <w:r>
+        <w:rPr>
+          <w:rFonts w:ascii="Arial" w:eastAsia="Batang" w:hAnsi="Arial" w:cs="Arial"/>
+          <w:sz w:val="14"/>
+          <w:szCs w:val="14"/>
+          <w:lang w:val="es-MX"/>
+        </w:rPr>
+        <w:t>{{ fecha</w:t>
+      </w:r>
+      <w:r>
+        <w:rPr>
+          <w:rFonts w:ascii="Arial" w:eastAsia="Batang" w:hAnsi="Arial" w:cs="Arial"/>
+          <w:sz w:val="14"/>
+          <w:szCs w:val="14"/>
+          <w:lang w:val="es-MX"/>
+        </w:rPr>
+        <w:t>_</w:t>
+      </w:r>
+      <w:r>
+        <w:rPr>
+          <w:rFonts w:ascii="Arial" w:eastAsia="Batang" w:hAnsi="Arial" w:cs="Arial"/>
+          <w:sz w:val="14"/>
+          <w:szCs w:val="14"/>
+          <w:lang w:val="es-MX"/>
+        </w:rPr>
+        <w:t>escritura</w:t>
+      </w:r>
+      <w:r>
+        <w:rPr>
+          <w:rFonts w:ascii="Arial" w:eastAsia="Batang" w:hAnsi="Arial" w:cs="Arial"/>
+          <w:sz w:val="14"/>
+          <w:szCs w:val="14"/>
+          <w:lang w:val="es-MX"/>
+        </w:rPr>
+        <w:t xml:space="preserve"> }}</w:t>
+      </w:r>
+      <w:r>
+        <w:rPr>
+          <w:rFonts w:ascii="Arial" w:eastAsia="Batang" w:hAnsi="Arial" w:cs="Arial"/>
+          <w:sz w:val="14"/>
+          <w:szCs w:val="14"/>
+        </w:rPr>
+        <w:t>,</w:t>
+      </w:r>
+      <w:bookmarkStart w:id="4" w:name="_Hlk150194100"/>
+      <w:r>
+        <w:rPr>
+          <w:rFonts w:ascii="Arial" w:eastAsia="Batang" w:hAnsi="Arial" w:cs="Arial"/>
+          <w:sz w:val="14"/>
+          <w:szCs w:val="14"/>
+        </w:rPr>
+        <w:t xml:space="preserve"> </w:t>
+      </w:r>
+      <w:r>
+        <w:rPr>
+          <w:rFonts w:ascii="Arial" w:eastAsia="Batang" w:hAnsi="Arial" w:cs="Arial"/>
+          <w:sz w:val="14"/>
+          <w:szCs w:val="14"/>
+          <w:lang w:val="es-ES"/>
+        </w:rPr>
+        <w:t>otorgado ante</w:t>
+      </w:r>
+      <w:bookmarkEnd w:id="4"/>
+      <w:r>
+        <w:rPr>
+          <w:rFonts w:ascii="Arial" w:eastAsia="Batang" w:hAnsi="Arial" w:cs="Arial"/>
+          <w:sz w:val="14"/>
+          <w:szCs w:val="14"/>
+          <w:lang w:val="es-ES"/>
+        </w:rPr>
+        <w:t xml:space="preserve"> la fe del Licenciado</w:t>
+      </w:r>
+      <w:r>
+        <w:rPr>
+          <w:rFonts w:ascii="Arial" w:eastAsia="Batang" w:hAnsi="Arial" w:cs="Arial"/>
+          <w:sz w:val="14"/>
+          <w:szCs w:val="14"/>
+          <w:lang w:val="es-ES"/>
+        </w:rPr>
+        <w:t xml:space="preserve"> </w:t>
+      </w:r>
+      <w:r>
+        <w:rPr>
+          <w:rFonts w:ascii="Arial" w:eastAsia="Batang" w:hAnsi="Arial" w:cs="Arial"/>
+          <w:bCs/>
+          <w:sz w:val="14"/>
+          <w:szCs w:val="14"/>
+          <w:lang w:val="es-MX"/>
+        </w:rPr>
         <w:t xml:space="preserve">{{ </w:t>
       </w:r>
-      <w:proofErr w:type="spellStart"/>
-      <w:r>
-        <w:rPr>
-          <w:rFonts w:ascii="Arial" w:eastAsia="Batang" w:hAnsi="Arial" w:cs="Arial"/>
-          <w:b/>
+      <w:r>
+        <w:rPr>
+          <w:rFonts w:ascii="Arial" w:eastAsia="Batang" w:hAnsi="Arial" w:cs="Arial"/>
           <w:bCs/>
           <w:sz w:val="14"/>
           <w:szCs w:val="14"/>
           <w:lang w:val="es-MX"/>
         </w:rPr>
-        <w:t>numero_</w:t>
-      </w:r>
-      <w:r>
-        <w:rPr>
-          <w:rFonts w:ascii="Arial" w:eastAsia="Batang" w:hAnsi="Arial" w:cs="Arial"/>
-          <w:b/>
+        <w:t>notario_origen_completo</w:t>
+      </w:r>
+      <w:r>
+        <w:rPr>
+          <w:rFonts w:ascii="Arial" w:eastAsia="Batang" w:hAnsi="Arial" w:cs="Arial"/>
           <w:bCs/>
           <w:sz w:val="14"/>
           <w:szCs w:val="14"/>
           <w:lang w:val="es-MX"/>
         </w:rPr>
-        <w:t>escritura</w:t>
-      </w:r>
-      <w:proofErr w:type="spellEnd"/>
-      <w:r>
-        <w:rPr>
-          <w:rFonts w:ascii="Arial" w:eastAsia="Batang" w:hAnsi="Arial" w:cs="Arial"/>
-          <w:b/>
-          <w:bCs/>
+        <w:t xml:space="preserve"> }}</w:t>
+      </w:r>
+      <w:r>
+        <w:rPr>
+          <w:rFonts w:ascii="Arial" w:eastAsia="Batang" w:hAnsi="Arial" w:cs="Arial"/>
+          <w:sz w:val="14"/>
+          <w:szCs w:val="14"/>
+        </w:rPr>
+        <w:t>,</w:t>
+      </w:r>
+      <w:r>
+        <w:rPr>
+          <w:rFonts w:ascii="Arial" w:eastAsia="Batang" w:hAnsi="Arial" w:cs="Arial"/>
+          <w:sz w:val="14"/>
+          <w:szCs w:val="14"/>
+        </w:rPr>
+        <w:t xml:space="preserve"> </w:t>
+      </w:r>
+      <w:r>
+        <w:rPr>
+          <w:rFonts w:ascii="Arial" w:eastAsia="Batang" w:hAnsi="Arial" w:cs="Arial"/>
+          <w:sz w:val="14"/>
+          <w:szCs w:val="14"/>
+        </w:rPr>
+        <w:t xml:space="preserve">se hizo constar </w:t>
+      </w:r>
+      <w:r>
+        <w:rPr>
+          <w:rFonts w:ascii="Arial" w:eastAsia="Batang" w:hAnsi="Arial" w:cs="Arial"/>
+          <w:sz w:val="14"/>
+          <w:szCs w:val="14"/>
+        </w:rPr>
+        <w:t>entre otros actos</w:t>
+      </w:r>
+      <w:r>
+        <w:rPr>
+          <w:rFonts w:ascii="Arial" w:eastAsia="Batang" w:hAnsi="Arial" w:cs="Arial"/>
+          <w:sz w:val="14"/>
+          <w:szCs w:val="14"/>
+        </w:rPr>
+        <w:t>,</w:t>
+      </w:r>
+      <w:r>
+        <w:rPr>
+          <w:rFonts w:ascii="Arial" w:eastAsia="Batang" w:hAnsi="Arial" w:cs="Arial"/>
+          <w:sz w:val="14"/>
+          <w:szCs w:val="14"/>
+        </w:rPr>
+        <w:t xml:space="preserve"> </w:t>
+      </w:r>
+      <w:r>
+        <w:rPr>
+          <w:rFonts w:ascii="Arial" w:eastAsia="Batang" w:hAnsi="Arial" w:cs="Arial"/>
+          <w:bCs/>
+          <w:sz w:val="14"/>
+          <w:szCs w:val="14"/>
+        </w:rPr>
+        <w:t xml:space="preserve">el </w:t>
+      </w:r>
+      <w:r>
+        <w:rPr>
+          <w:rFonts w:ascii="Arial" w:eastAsia="Batang" w:hAnsi="Arial" w:cs="Arial"/>
+          <w:bCs/>
+          <w:sz w:val="14"/>
+          <w:szCs w:val="14"/>
+        </w:rPr>
+        <w:t>otorgamiento de crédito y constitución de garantía hipotecaria</w:t>
+      </w:r>
+      <w:r>
+        <w:rPr>
+          <w:rFonts w:ascii="Arial" w:eastAsia="Batang" w:hAnsi="Arial" w:cs="Arial"/>
+          <w:bCs/>
+          <w:sz w:val="14"/>
+          <w:szCs w:val="14"/>
+        </w:rPr>
+        <w:t>,</w:t>
+      </w:r>
+      <w:r>
+        <w:rPr>
+          <w:rFonts w:ascii="Arial" w:eastAsia="Batang" w:hAnsi="Arial" w:cs="Arial"/>
+          <w:b/>
+          <w:sz w:val="14"/>
+          <w:szCs w:val="14"/>
+        </w:rPr>
+        <w:t xml:space="preserve"> </w:t>
+      </w:r>
+      <w:r>
+        <w:rPr>
+          <w:rFonts w:ascii="Arial" w:eastAsia="Batang" w:hAnsi="Arial" w:cs="Arial"/>
+          <w:sz w:val="14"/>
+          <w:szCs w:val="14"/>
+        </w:rPr>
+        <w:t>por medio del cual</w:t>
+      </w:r>
+      <w:r>
+        <w:rPr>
+          <w:rFonts w:ascii="Arial" w:eastAsia="Batang" w:hAnsi="Arial" w:cs="Arial"/>
+          <w:sz w:val="14"/>
+          <w:szCs w:val="14"/>
+        </w:rPr>
+        <w:t xml:space="preserve"> el</w:t>
+      </w:r>
+      <w:r>
+        <w:rPr>
+          <w:rFonts w:ascii="Arial" w:eastAsia="Batang" w:hAnsi="Arial" w:cs="Arial"/>
+          <w:sz w:val="14"/>
+          <w:szCs w:val="14"/>
+        </w:rPr>
+        <w:t xml:space="preserve"> </w:t>
+      </w:r>
+      <w:r>
+        <w:rPr>
+          <w:rFonts w:ascii="Arial" w:eastAsia="Batang" w:hAnsi="Arial" w:cs="Arial"/>
+          <w:b/>
+          <w:sz w:val="14"/>
+          <w:szCs w:val="14"/>
+        </w:rPr>
+        <w:t xml:space="preserve">INSTITUTO DEL FONDO NACIONAL </w:t>
+      </w:r>
+      <w:r>
+        <w:rPr>
+          <w:rFonts w:ascii="Arial" w:eastAsia="Batang" w:hAnsi="Arial" w:cs="Arial"/>
+          <w:b/>
+          <w:sz w:val="14"/>
+          <w:szCs w:val="14"/>
+        </w:rPr>
+        <w:t xml:space="preserve">DE LA VIVIENDA </w:t>
+      </w:r>
+      <w:r>
+        <w:rPr>
+          <w:rFonts w:ascii="Arial" w:eastAsia="Batang" w:hAnsi="Arial" w:cs="Arial"/>
+          <w:b/>
+          <w:sz w:val="14"/>
+          <w:szCs w:val="14"/>
+        </w:rPr>
+        <w:t>PARA LOS TRABAJADORES</w:t>
+      </w:r>
+      <w:r>
+        <w:rPr>
+          <w:rFonts w:ascii="Arial" w:eastAsia="Batang" w:hAnsi="Arial" w:cs="Arial"/>
+          <w:sz w:val="14"/>
+          <w:szCs w:val="14"/>
+        </w:rPr>
+        <w:t>,</w:t>
+      </w:r>
+      <w:r>
+        <w:rPr>
+          <w:rFonts w:ascii="Arial" w:eastAsia="Batang" w:hAnsi="Arial" w:cs="Arial"/>
+          <w:b/>
+          <w:sz w:val="14"/>
+          <w:szCs w:val="14"/>
+        </w:rPr>
+        <w:t xml:space="preserve"> </w:t>
+      </w:r>
+      <w:r>
+        <w:rPr>
+          <w:rFonts w:ascii="Arial" w:eastAsia="Batang" w:hAnsi="Arial" w:cs="Arial"/>
+          <w:sz w:val="14"/>
+          <w:szCs w:val="14"/>
+        </w:rPr>
+        <w:t>otorg</w:t>
+      </w:r>
+      <w:r>
+        <w:rPr>
+          <w:rFonts w:ascii="Arial" w:eastAsia="Batang" w:hAnsi="Arial" w:cs="Arial"/>
+          <w:sz w:val="14"/>
+          <w:szCs w:val="14"/>
+        </w:rPr>
+        <w:t>ó</w:t>
+      </w:r>
+      <w:r>
+        <w:rPr>
+          <w:rFonts w:ascii="Arial" w:eastAsia="Batang" w:hAnsi="Arial" w:cs="Arial"/>
+          <w:sz w:val="14"/>
+          <w:szCs w:val="14"/>
+        </w:rPr>
+        <w:t xml:space="preserve"> </w:t>
+      </w:r>
+      <w:r>
+        <w:rPr>
+          <w:rFonts w:ascii="Arial" w:eastAsia="Batang" w:hAnsi="Arial" w:cs="Arial"/>
+          <w:sz w:val="14"/>
+          <w:szCs w:val="14"/>
+        </w:rPr>
+        <w:t xml:space="preserve">a la </w:t>
+      </w:r>
+      <w:r>
+        <w:rPr>
+          <w:rFonts w:ascii="Arial" w:eastAsia="Batang" w:hAnsi="Arial" w:cs="Arial"/>
+          <w:sz w:val="14"/>
+          <w:szCs w:val="14"/>
+        </w:rPr>
+        <w:t>señor</w:t>
+      </w:r>
+      <w:r>
+        <w:rPr>
+          <w:rFonts w:ascii="Arial" w:eastAsia="Batang" w:hAnsi="Arial" w:cs="Arial"/>
+          <w:sz w:val="14"/>
+          <w:szCs w:val="14"/>
+        </w:rPr>
+        <w:t>a</w:t>
+      </w:r>
+      <w:r>
+        <w:rPr>
+          <w:rFonts w:ascii="Arial" w:eastAsia="Batang" w:hAnsi="Arial" w:cs="Arial"/>
+          <w:sz w:val="14"/>
+          <w:szCs w:val="14"/>
+        </w:rPr>
+        <w:t xml:space="preserve"> </w:t>
+      </w:r>
+      <w:r>
+        <w:rPr>
+          <w:rFonts w:ascii="Arial" w:hAnsi="Arial" w:cs="Arial"/>
+          <w:b/>
           <w:sz w:val="14"/>
           <w:szCs w:val="14"/>
           <w:lang w:val="es-MX"/>
         </w:rPr>
-        <w:t xml:space="preserve"> }}</w:t>
-      </w:r>
-      <w:r>
-        <w:rPr>
-          <w:rFonts w:ascii="Arial" w:eastAsia="Batang" w:hAnsi="Arial" w:cs="Arial"/>
-          <w:sz w:val="14"/>
-          <w:szCs w:val="14"/>
-        </w:rPr>
-        <w:t>,</w:t>
-      </w:r>
-      <w:r>
-        <w:rPr>
-          <w:rFonts w:ascii="Arial" w:eastAsia="Batang" w:hAnsi="Arial" w:cs="Arial"/>
-          <w:sz w:val="14"/>
-          <w:szCs w:val="14"/>
-        </w:rPr>
-        <w:t xml:space="preserve"> </w:t>
-      </w:r>
-      <w:r>
-        <w:rPr>
-          <w:rFonts w:ascii="Arial" w:eastAsia="Batang" w:hAnsi="Arial" w:cs="Arial"/>
-          <w:sz w:val="14"/>
-          <w:szCs w:val="14"/>
-        </w:rPr>
-        <w:t>de fecha</w:t>
-      </w:r>
-      <w:r>
-        <w:rPr>
-          <w:rFonts w:ascii="Arial" w:eastAsia="Batang" w:hAnsi="Arial" w:cs="Arial"/>
-          <w:sz w:val="14"/>
-          <w:szCs w:val="14"/>
-        </w:rPr>
-        <w:t xml:space="preserve"> </w:t>
-      </w:r>
-      <w:r>
-        <w:rPr>
-          <w:rFonts w:ascii="Arial" w:eastAsia="Batang" w:hAnsi="Arial" w:cs="Arial"/>
+        <w:t>{{ nombre_acreditado }}</w:t>
+      </w:r>
+      <w:r>
+        <w:rPr>
+          <w:rFonts w:ascii="Arial" w:hAnsi="Arial" w:cs="Arial"/>
+          <w:bCs/>
+          <w:sz w:val="14"/>
+          <w:szCs w:val="14"/>
+        </w:rPr>
+        <w:t xml:space="preserve">, </w:t>
+      </w:r>
+      <w:r>
+        <w:rPr>
+          <w:rFonts w:ascii="Arial" w:eastAsia="Batang" w:hAnsi="Arial" w:cs="Arial"/>
+          <w:bCs/>
+          <w:sz w:val="14"/>
+          <w:szCs w:val="14"/>
+        </w:rPr>
+        <w:t xml:space="preserve">un crédito </w:t>
+      </w:r>
+      <w:r>
+        <w:rPr>
+          <w:rFonts w:ascii="Arial" w:eastAsia="Batang" w:hAnsi="Arial" w:cs="Arial"/>
+          <w:sz w:val="14"/>
+          <w:szCs w:val="14"/>
+        </w:rPr>
+        <w:t>hasta</w:t>
+      </w:r>
+      <w:r>
+        <w:rPr>
+          <w:rFonts w:ascii="Arial" w:eastAsia="Batang" w:hAnsi="Arial" w:cs="Arial"/>
+          <w:sz w:val="14"/>
+          <w:szCs w:val="14"/>
+        </w:rPr>
+        <w:t xml:space="preserve"> </w:t>
+      </w:r>
+      <w:r>
+        <w:rPr>
+          <w:rFonts w:ascii="Arial" w:eastAsia="Batang" w:hAnsi="Arial" w:cs="Arial"/>
+          <w:sz w:val="14"/>
+          <w:szCs w:val="14"/>
+        </w:rPr>
+        <w:t>por</w:t>
+      </w:r>
+      <w:r>
+        <w:rPr>
+          <w:rFonts w:ascii="Arial" w:eastAsia="Batang" w:hAnsi="Arial" w:cs="Arial"/>
+          <w:sz w:val="14"/>
+          <w:szCs w:val="14"/>
+        </w:rPr>
+        <w:t xml:space="preserve"> {{ crédito_a_salario }}</w:t>
+      </w:r>
+      <w:r>
+        <w:rPr>
+          <w:rFonts w:ascii="Arial" w:eastAsia="Batang" w:hAnsi="Arial" w:cs="Arial"/>
+          <w:sz w:val="14"/>
+          <w:szCs w:val="14"/>
+        </w:rPr>
+        <w:t xml:space="preserve"> </w:t>
+      </w:r>
+      <w:r>
+        <w:rPr>
+          <w:rFonts w:ascii="Arial" w:eastAsia="Batang" w:hAnsi="Arial" w:cs="Arial"/>
+          <w:sz w:val="14"/>
+          <w:szCs w:val="14"/>
+        </w:rPr>
+        <w:t>veces el salario mínimo mensual vigente en ese entonces</w:t>
+      </w:r>
+      <w:r>
+        <w:rPr>
+          <w:rFonts w:ascii="Arial" w:eastAsia="Batang" w:hAnsi="Arial" w:cs="Arial"/>
+          <w:sz w:val="14"/>
+          <w:szCs w:val="14"/>
+        </w:rPr>
+        <w:t xml:space="preserve"> en el Distrito Federal</w:t>
+      </w:r>
+      <w:r>
+        <w:rPr>
+          <w:rFonts w:ascii="Arial" w:eastAsia="Batang" w:hAnsi="Arial" w:cs="Arial"/>
+          <w:b/>
+          <w:bCs/>
+          <w:iCs/>
           <w:sz w:val="14"/>
           <w:szCs w:val="14"/>
           <w:lang w:val="es-MX"/>
         </w:rPr>
-        <w:t xml:space="preserve">{{ </w:t>
-      </w:r>
-      <w:proofErr w:type="spellStart"/>
-      <w:r>
-        <w:rPr>
-          <w:rFonts w:ascii="Arial" w:eastAsia="Batang" w:hAnsi="Arial" w:cs="Arial"/>
-          <w:sz w:val="14"/>
-          <w:szCs w:val="14"/>
-          <w:lang w:val="es-MX"/>
-        </w:rPr>
-        <w:t>fecha</w:t>
-      </w:r>
-      <w:r>
-        <w:rPr>
-          <w:rFonts w:ascii="Arial" w:eastAsia="Batang" w:hAnsi="Arial" w:cs="Arial"/>
-          <w:sz w:val="14"/>
-          <w:szCs w:val="14"/>
-          <w:lang w:val="es-MX"/>
-        </w:rPr>
-        <w:t>_</w:t>
-      </w:r>
-      <w:r>
-        <w:rPr>
-          <w:rFonts w:ascii="Arial" w:eastAsia="Batang" w:hAnsi="Arial" w:cs="Arial"/>
-          <w:sz w:val="14"/>
-          <w:szCs w:val="14"/>
-          <w:lang w:val="es-MX"/>
-        </w:rPr>
-        <w:t>escritura</w:t>
-      </w:r>
-      <w:proofErr w:type="spellEnd"/>
-      <w:r>
-        <w:rPr>
-          <w:rFonts w:ascii="Arial" w:eastAsia="Batang" w:hAnsi="Arial" w:cs="Arial"/>
-          <w:sz w:val="14"/>
-          <w:szCs w:val="14"/>
-          <w:lang w:val="es-MX"/>
-        </w:rPr>
-        <w:t xml:space="preserve"> }}</w:t>
-      </w:r>
-      <w:r>
-        <w:rPr>
-          <w:rFonts w:ascii="Arial" w:eastAsia="Batang" w:hAnsi="Arial" w:cs="Arial"/>
-          <w:sz w:val="14"/>
-          <w:szCs w:val="14"/>
-        </w:rPr>
-        <w:t>,</w:t>
-      </w:r>
-      <w:bookmarkStart w:id="4" w:name="_Hlk150194100"/>
-      <w:r>
-        <w:rPr>
-          <w:rFonts w:ascii="Arial" w:eastAsia="Batang" w:hAnsi="Arial" w:cs="Arial"/>
-          <w:sz w:val="14"/>
-          <w:szCs w:val="14"/>
-        </w:rPr>
-        <w:t xml:space="preserve"> </w:t>
-      </w:r>
-      <w:r>
-        <w:rPr>
-          <w:rFonts w:ascii="Arial" w:eastAsia="Batang" w:hAnsi="Arial" w:cs="Arial"/>
-          <w:sz w:val="14"/>
-          <w:szCs w:val="14"/>
-          <w:lang w:val="es-ES"/>
-        </w:rPr>
-        <w:t>otorgado ante</w:t>
-      </w:r>
-      <w:bookmarkEnd w:id="4"/>
-      <w:r>
-        <w:rPr>
-          <w:rFonts w:ascii="Arial" w:eastAsia="Batang" w:hAnsi="Arial" w:cs="Arial"/>
-          <w:sz w:val="14"/>
-          <w:szCs w:val="14"/>
-          <w:lang w:val="es-ES"/>
-        </w:rPr>
-        <w:t xml:space="preserve"> la fe del Licenciado</w:t>
-      </w:r>
-      <w:r>
-        <w:rPr>
-          <w:rFonts w:ascii="Arial" w:eastAsia="Batang" w:hAnsi="Arial" w:cs="Arial"/>
-          <w:sz w:val="14"/>
-          <w:szCs w:val="14"/>
-          <w:lang w:val="es-ES"/>
-        </w:rPr>
-        <w:t xml:space="preserve"> </w:t>
-      </w:r>
-      <w:r>
-        <w:rPr>
-          <w:rFonts w:ascii="Arial" w:eastAsia="Batang" w:hAnsi="Arial" w:cs="Arial"/>
-          <w:bCs/>
-          <w:sz w:val="14"/>
-          <w:szCs w:val="14"/>
-          <w:lang w:val="es-MX"/>
-        </w:rPr>
-        <w:t xml:space="preserve">{{ </w:t>
-      </w:r>
-      <w:proofErr w:type="spellStart"/>
-      <w:r>
-        <w:rPr>
-          <w:rFonts w:ascii="Arial" w:eastAsia="Batang" w:hAnsi="Arial" w:cs="Arial"/>
-          <w:bCs/>
-          <w:sz w:val="14"/>
-          <w:szCs w:val="14"/>
-          <w:lang w:val="es-MX"/>
-        </w:rPr>
-        <w:t>notario_origen_completo</w:t>
-      </w:r>
-      <w:proofErr w:type="spellEnd"/>
-      <w:r>
-        <w:rPr>
-          <w:rFonts w:ascii="Arial" w:eastAsia="Batang" w:hAnsi="Arial" w:cs="Arial"/>
-          <w:bCs/>
-          <w:sz w:val="14"/>
-          <w:szCs w:val="14"/>
-          <w:lang w:val="es-MX"/>
-        </w:rPr>
-        <w:t xml:space="preserve"> }}</w:t>
-      </w:r>
-      <w:r>
-        <w:rPr>
-          <w:rFonts w:ascii="Arial" w:eastAsia="Batang" w:hAnsi="Arial" w:cs="Arial"/>
-          <w:sz w:val="14"/>
-          <w:szCs w:val="14"/>
-        </w:rPr>
-        <w:t>,</w:t>
-      </w:r>
-      <w:r>
-        <w:rPr>
-          <w:rFonts w:ascii="Arial" w:eastAsia="Batang" w:hAnsi="Arial" w:cs="Arial"/>
-          <w:sz w:val="14"/>
-          <w:szCs w:val="14"/>
-        </w:rPr>
-        <w:t xml:space="preserve"> </w:t>
-      </w:r>
-      <w:r>
-        <w:rPr>
-          <w:rFonts w:ascii="Arial" w:eastAsia="Batang" w:hAnsi="Arial" w:cs="Arial"/>
-          <w:sz w:val="14"/>
-          <w:szCs w:val="14"/>
-        </w:rPr>
-        <w:t xml:space="preserve">se hizo constar </w:t>
-      </w:r>
-      <w:r>
-        <w:rPr>
-          <w:rFonts w:ascii="Arial" w:eastAsia="Batang" w:hAnsi="Arial" w:cs="Arial"/>
-          <w:sz w:val="14"/>
-          <w:szCs w:val="14"/>
-        </w:rPr>
-        <w:t>entre otros actos</w:t>
-      </w:r>
-      <w:r>
-        <w:rPr>
-          <w:rFonts w:ascii="Arial" w:eastAsia="Batang" w:hAnsi="Arial" w:cs="Arial"/>
-          <w:sz w:val="14"/>
-          <w:szCs w:val="14"/>
-        </w:rPr>
-        <w:t>,</w:t>
-      </w:r>
-      <w:r>
-        <w:rPr>
-          <w:rFonts w:ascii="Arial" w:eastAsia="Batang" w:hAnsi="Arial" w:cs="Arial"/>
-          <w:sz w:val="14"/>
-          <w:szCs w:val="14"/>
-        </w:rPr>
-        <w:t xml:space="preserve"> </w:t>
-      </w:r>
-      <w:r>
-        <w:rPr>
-          <w:rFonts w:ascii="Arial" w:eastAsia="Batang" w:hAnsi="Arial" w:cs="Arial"/>
-          <w:bCs/>
-          <w:sz w:val="14"/>
-          <w:szCs w:val="14"/>
-        </w:rPr>
-        <w:t xml:space="preserve">el </w:t>
-      </w:r>
-      <w:r>
-        <w:rPr>
-          <w:rFonts w:ascii="Arial" w:eastAsia="Batang" w:hAnsi="Arial" w:cs="Arial"/>
-          <w:bCs/>
-          <w:sz w:val="14"/>
-          <w:szCs w:val="14"/>
-        </w:rPr>
-        <w:t>otorgamiento de crédito y constitución de garantía hipotecaria</w:t>
-      </w:r>
-      <w:r>
-        <w:rPr>
-          <w:rFonts w:ascii="Arial" w:eastAsia="Batang" w:hAnsi="Arial" w:cs="Arial"/>
-          <w:bCs/>
-          <w:sz w:val="14"/>
-          <w:szCs w:val="14"/>
-        </w:rPr>
-        <w:t>,</w:t>
-      </w:r>
-      <w:r>
-        <w:rPr>
-          <w:rFonts w:ascii="Arial" w:eastAsia="Batang" w:hAnsi="Arial" w:cs="Arial"/>
-          <w:b/>
-          <w:sz w:val="14"/>
-          <w:szCs w:val="14"/>
-        </w:rPr>
-        <w:t xml:space="preserve"> </w:t>
-      </w:r>
-      <w:r>
-        <w:rPr>
-          <w:rFonts w:ascii="Arial" w:eastAsia="Batang" w:hAnsi="Arial" w:cs="Arial"/>
-          <w:sz w:val="14"/>
-          <w:szCs w:val="14"/>
-        </w:rPr>
-        <w:t>por medio del cual</w:t>
-      </w:r>
-      <w:r>
-        <w:rPr>
-          <w:rFonts w:ascii="Arial" w:eastAsia="Batang" w:hAnsi="Arial" w:cs="Arial"/>
-          <w:sz w:val="14"/>
-          <w:szCs w:val="14"/>
-        </w:rPr>
-        <w:t xml:space="preserve"> el</w:t>
-      </w:r>
-      <w:r>
-        <w:rPr>
-          <w:rFonts w:ascii="Arial" w:eastAsia="Batang" w:hAnsi="Arial" w:cs="Arial"/>
-          <w:sz w:val="14"/>
-          <w:szCs w:val="14"/>
-        </w:rPr>
-        <w:t xml:space="preserve"> </w:t>
-      </w:r>
-      <w:r>
-        <w:rPr>
-          <w:rFonts w:ascii="Arial" w:eastAsia="Batang" w:hAnsi="Arial" w:cs="Arial"/>
-          <w:b/>
-          <w:sz w:val="14"/>
-          <w:szCs w:val="14"/>
-        </w:rPr>
-        <w:t xml:space="preserve">INSTITUTO DEL FONDO NACIONAL </w:t>
-      </w:r>
-      <w:r>
-        <w:rPr>
-          <w:rFonts w:ascii="Arial" w:eastAsia="Batang" w:hAnsi="Arial" w:cs="Arial"/>
-          <w:b/>
-          <w:sz w:val="14"/>
-          <w:szCs w:val="14"/>
-        </w:rPr>
-        <w:t xml:space="preserve">DE LA VIVIENDA </w:t>
-      </w:r>
-      <w:r>
-        <w:rPr>
-          <w:rFonts w:ascii="Arial" w:eastAsia="Batang" w:hAnsi="Arial" w:cs="Arial"/>
-          <w:b/>
-          <w:sz w:val="14"/>
-          <w:szCs w:val="14"/>
-        </w:rPr>
-        <w:t>PARA LOS TRABAJADORES</w:t>
-      </w:r>
-      <w:r>
-        <w:rPr>
-          <w:rFonts w:ascii="Arial" w:eastAsia="Batang" w:hAnsi="Arial" w:cs="Arial"/>
-          <w:sz w:val="14"/>
-          <w:szCs w:val="14"/>
-        </w:rPr>
-        <w:t>,</w:t>
-      </w:r>
-      <w:r>
-        <w:rPr>
-          <w:rFonts w:ascii="Arial" w:eastAsia="Batang" w:hAnsi="Arial" w:cs="Arial"/>
-          <w:b/>
-          <w:sz w:val="14"/>
-          <w:szCs w:val="14"/>
-        </w:rPr>
-        <w:t xml:space="preserve"> </w:t>
-      </w:r>
-      <w:r>
-        <w:rPr>
-          <w:rFonts w:ascii="Arial" w:eastAsia="Batang" w:hAnsi="Arial" w:cs="Arial"/>
-          <w:sz w:val="14"/>
-          <w:szCs w:val="14"/>
-        </w:rPr>
-        <w:t>otorg</w:t>
-      </w:r>
-      <w:r>
-        <w:rPr>
-          <w:rFonts w:ascii="Arial" w:eastAsia="Batang" w:hAnsi="Arial" w:cs="Arial"/>
-          <w:sz w:val="14"/>
-          <w:szCs w:val="14"/>
-        </w:rPr>
-        <w:t>ó</w:t>
-      </w:r>
-      <w:r>
-        <w:rPr>
-          <w:rFonts w:ascii="Arial" w:eastAsia="Batang" w:hAnsi="Arial" w:cs="Arial"/>
-          <w:sz w:val="14"/>
-          <w:szCs w:val="14"/>
-        </w:rPr>
-        <w:t xml:space="preserve"> </w:t>
-      </w:r>
-      <w:r>
-        <w:rPr>
-          <w:rFonts w:ascii="Arial" w:eastAsia="Batang" w:hAnsi="Arial" w:cs="Arial"/>
-          <w:sz w:val="14"/>
-          <w:szCs w:val="14"/>
-        </w:rPr>
-        <w:t xml:space="preserve">a la </w:t>
-      </w:r>
-      <w:r>
-        <w:rPr>
-          <w:rFonts w:ascii="Arial" w:eastAsia="Batang" w:hAnsi="Arial" w:cs="Arial"/>
-          <w:sz w:val="14"/>
-          <w:szCs w:val="14"/>
-        </w:rPr>
-        <w:t>señor</w:t>
-      </w:r>
-      <w:r>
-        <w:rPr>
-          <w:rFonts w:ascii="Arial" w:eastAsia="Batang" w:hAnsi="Arial" w:cs="Arial"/>
-          <w:sz w:val="14"/>
-          <w:szCs w:val="14"/>
-        </w:rPr>
-        <w:t>a</w:t>
-      </w:r>
-      <w:r>
-        <w:rPr>
-          <w:rFonts w:ascii="Arial" w:eastAsia="Batang" w:hAnsi="Arial" w:cs="Arial"/>
-          <w:sz w:val="14"/>
-          <w:szCs w:val="14"/>
-        </w:rPr>
-        <w:t xml:space="preserve"> </w:t>
-      </w:r>
-      <w:r>
-        <w:rPr>
-          <w:rFonts w:ascii="Arial" w:hAnsi="Arial" w:cs="Arial"/>
-          <w:b/>
-          <w:bCs/>
-          <w:sz w:val="14"/>
-          <w:szCs w:val="14"/>
-          <w:lang w:val="es-ES"/>
-        </w:rPr>
-        <w:t xml:space="preserve"> </w:t>
-      </w:r>
-      <w:r>
-        <w:rPr>
-          <w:rFonts w:ascii="Arial" w:hAnsi="Arial" w:cs="Arial"/>
-          <w:b/>
-          <w:sz w:val="14"/>
-          <w:szCs w:val="14"/>
-          <w:lang w:val="es-MX"/>
-        </w:rPr>
-        <w:t xml:space="preserve">{{ </w:t>
-      </w:r>
-      <w:proofErr w:type="spellStart"/>
-      <w:r>
-        <w:rPr>
-          <w:rFonts w:ascii="Arial" w:hAnsi="Arial" w:cs="Arial"/>
-          <w:b/>
-          <w:sz w:val="14"/>
-          <w:szCs w:val="14"/>
-          <w:lang w:val="es-MX"/>
-        </w:rPr>
-        <w:t>nombre_acreditado</w:t>
-      </w:r>
-      <w:proofErr w:type="spellEnd"/>
-      <w:r>
-        <w:rPr>
-          <w:rFonts w:ascii="Arial" w:hAnsi="Arial" w:cs="Arial"/>
-          <w:b/>
-          <w:sz w:val="14"/>
-          <w:szCs w:val="14"/>
-          <w:lang w:val="es-MX"/>
-        </w:rPr>
-        <w:t xml:space="preserve"> }}</w:t>
-      </w:r>
-      <w:r>
-        <w:rPr>
-          <w:rFonts w:ascii="Arial" w:hAnsi="Arial" w:cs="Arial"/>
-          <w:bCs/>
-          <w:sz w:val="14"/>
-          <w:szCs w:val="14"/>
-        </w:rPr>
         <w:t xml:space="preserve">, </w:t>
       </w:r>
       <w:r>
         <w:rPr>
           <w:rFonts w:ascii="Arial" w:eastAsia="Batang" w:hAnsi="Arial" w:cs="Arial"/>
-          <w:bCs/>
-          <w:sz w:val="14"/>
-          <w:szCs w:val="14"/>
-        </w:rPr>
-        <w:t xml:space="preserve">un crédito </w:t>
-      </w:r>
-      <w:r>
-        <w:rPr>
-          <w:rFonts w:ascii="Arial" w:eastAsia="Batang" w:hAnsi="Arial" w:cs="Arial"/>
-          <w:sz w:val="14"/>
-          <w:szCs w:val="14"/>
-        </w:rPr>
-        <w:t>hasta</w:t>
-      </w:r>
-      <w:r>
-        <w:rPr>
-          <w:rFonts w:ascii="Arial" w:eastAsia="Batang" w:hAnsi="Arial" w:cs="Arial"/>
-          <w:sz w:val="14"/>
-          <w:szCs w:val="14"/>
-        </w:rPr>
-        <w:t xml:space="preserve"> </w:t>
-      </w:r>
-      <w:r>
-        <w:rPr>
-          <w:rFonts w:ascii="Arial" w:eastAsia="Batang" w:hAnsi="Arial" w:cs="Arial"/>
-          <w:sz w:val="14"/>
-          <w:szCs w:val="14"/>
-        </w:rPr>
-        <w:t>por</w:t>
-      </w:r>
-      <w:r>
-        <w:rPr>
-          <w:rFonts w:ascii="Arial" w:eastAsia="Batang" w:hAnsi="Arial" w:cs="Arial"/>
-          <w:sz w:val="14"/>
-          <w:szCs w:val="14"/>
-        </w:rPr>
-        <w:t xml:space="preserve"> </w:t>
-      </w:r>
-      <w:r>
-        <w:rPr>
-          <w:rFonts w:ascii="Arial" w:eastAsia="Batang" w:hAnsi="Arial" w:cs="Arial"/>
-          <w:sz w:val="14"/>
-          <w:szCs w:val="14"/>
-        </w:rPr>
-        <w:t xml:space="preserve"> {{ </w:t>
-      </w:r>
-      <w:proofErr w:type="spellStart"/>
-      <w:r>
-        <w:rPr>
-          <w:rFonts w:ascii="Arial" w:eastAsia="Batang" w:hAnsi="Arial" w:cs="Arial"/>
-          <w:sz w:val="14"/>
-          <w:szCs w:val="14"/>
-        </w:rPr>
-        <w:t>crédito_a_salario</w:t>
-      </w:r>
-      <w:proofErr w:type="spellEnd"/>
-      <w:r>
-        <w:rPr>
-          <w:rFonts w:ascii="Arial" w:eastAsia="Batang" w:hAnsi="Arial" w:cs="Arial"/>
-          <w:sz w:val="14"/>
-          <w:szCs w:val="14"/>
-        </w:rPr>
-        <w:t xml:space="preserve"> }}</w:t>
-      </w:r>
-      <w:r>
-        <w:rPr>
-          <w:rFonts w:ascii="Arial" w:eastAsia="Batang" w:hAnsi="Arial" w:cs="Arial"/>
-          <w:sz w:val="14"/>
-          <w:szCs w:val="14"/>
-        </w:rPr>
-        <w:t xml:space="preserve"> </w:t>
-      </w:r>
-      <w:r>
-        <w:rPr>
-          <w:rFonts w:ascii="Arial" w:eastAsia="Batang" w:hAnsi="Arial" w:cs="Arial"/>
-          <w:sz w:val="14"/>
-          <w:szCs w:val="14"/>
-        </w:rPr>
-        <w:t>veces el salario mínimo mensual vigente en ese entonces</w:t>
-      </w:r>
-      <w:r>
-        <w:rPr>
-          <w:rFonts w:ascii="Arial" w:eastAsia="Batang" w:hAnsi="Arial" w:cs="Arial"/>
-          <w:sz w:val="14"/>
-          <w:szCs w:val="14"/>
-        </w:rPr>
-        <w:t xml:space="preserve"> en el Distrito Federal</w:t>
-      </w:r>
-      <w:r>
-        <w:rPr>
-          <w:rFonts w:ascii="Arial" w:eastAsia="Batang" w:hAnsi="Arial" w:cs="Arial"/>
-          <w:b/>
-          <w:bCs/>
           <w:iCs/>
           <w:sz w:val="14"/>
           <w:szCs w:val="14"/>
-          <w:lang w:val="es-MX"/>
-        </w:rPr>
-        <w:t xml:space="preserve">, </w:t>
-      </w:r>
-      <w:r>
-        <w:rPr>
-          <w:rFonts w:ascii="Arial" w:eastAsia="Batang" w:hAnsi="Arial" w:cs="Arial"/>
+        </w:rPr>
+        <w:t xml:space="preserve">equivalente a esa fecha a la cantidad de </w:t>
+      </w:r>
+      <w:r>
+        <w:rPr>
+          <w:rFonts w:ascii="Arial" w:eastAsia="Batang" w:hAnsi="Arial" w:cs="Arial"/>
+          <w:b/>
+          <w:bCs/>
           <w:iCs/>
           <w:sz w:val="14"/>
           <w:szCs w:val="14"/>
         </w:rPr>
-        <w:t xml:space="preserve">equivalente a esa fecha a la cantidad de </w:t>
-      </w:r>
-      <w:r>
-        <w:rPr>
-          <w:rFonts w:ascii="Arial" w:eastAsia="Batang" w:hAnsi="Arial" w:cs="Arial"/>
-          <w:b/>
-          <w:bCs/>
-          <w:iCs/>
-          <w:sz w:val="14"/>
-          <w:szCs w:val="14"/>
-        </w:rPr>
-        <w:t xml:space="preserve">{{ </w:t>
-      </w:r>
-      <w:proofErr w:type="spellStart"/>
-      <w:r>
-        <w:rPr>
-          <w:rFonts w:ascii="Arial" w:eastAsia="Batang" w:hAnsi="Arial" w:cs="Arial"/>
-          <w:b/>
-          <w:bCs/>
-          <w:iCs/>
-          <w:sz w:val="14"/>
-          <w:szCs w:val="14"/>
-        </w:rPr>
-        <w:t>monto_credito</w:t>
-      </w:r>
-      <w:proofErr w:type="spellEnd"/>
-      <w:r>
-        <w:rPr>
-          <w:rFonts w:ascii="Arial" w:eastAsia="Batang" w:hAnsi="Arial" w:cs="Arial"/>
-          <w:b/>
-          <w:bCs/>
-          <w:iCs/>
-          <w:sz w:val="14"/>
-          <w:szCs w:val="14"/>
-        </w:rPr>
-        <w:t xml:space="preserve"> }}</w:t>
+        <w:t>{{ monto_credito }}</w:t>
       </w:r>
       <w:r>
         <w:rPr>
@@ -2330,7 +2165,6 @@
         </w:rPr>
         <w:t xml:space="preserve"> </w:t>
       </w:r>
-      <w:proofErr w:type="gramStart"/>
       <w:r>
         <w:rPr>
           <w:rFonts w:ascii="Arial" w:eastAsia="Batang" w:hAnsi="Arial" w:cs="Arial"/>
@@ -2340,67 +2174,7 @@
           <w:szCs w:val="14"/>
           <w:lang w:val="es-MX"/>
         </w:rPr>
-        <w:t xml:space="preserve">{{ </w:t>
-      </w:r>
-      <w:proofErr w:type="spellStart"/>
-      <w:r>
-        <w:rPr>
-          <w:rFonts w:ascii="Arial" w:eastAsia="Batang" w:hAnsi="Arial" w:cs="Arial"/>
-          <w:b/>
-          <w:bCs/>
-          <w:sz w:val="14"/>
-          <w:szCs w:val="14"/>
-          <w:lang w:val="es-MX"/>
-        </w:rPr>
-        <w:t>datos</w:t>
-      </w:r>
-      <w:proofErr w:type="gramEnd"/>
-      <w:r>
-        <w:rPr>
-          <w:rFonts w:ascii="Arial" w:eastAsia="Batang" w:hAnsi="Arial" w:cs="Arial"/>
-          <w:b/>
-          <w:bCs/>
-          <w:sz w:val="14"/>
-          <w:szCs w:val="14"/>
-          <w:lang w:val="es-MX"/>
-        </w:rPr>
-        <w:t>_</w:t>
-      </w:r>
-      <w:proofErr w:type="gramStart"/>
-      <w:r>
-        <w:rPr>
-          <w:rFonts w:ascii="Arial" w:eastAsia="Batang" w:hAnsi="Arial" w:cs="Arial"/>
-          <w:b/>
-          <w:bCs/>
-          <w:sz w:val="14"/>
-          <w:szCs w:val="14"/>
-          <w:lang w:val="es-MX"/>
-        </w:rPr>
-        <w:t>inmueble</w:t>
-      </w:r>
-      <w:proofErr w:type="spellEnd"/>
-      <w:r>
-        <w:rPr>
-          <w:rFonts w:ascii="Arial" w:eastAsia="Batang" w:hAnsi="Arial" w:cs="Arial"/>
-          <w:b/>
-          <w:bCs/>
-          <w:sz w:val="14"/>
-          <w:szCs w:val="14"/>
-          <w:lang w:val="es-MX"/>
-        </w:rPr>
-        <w:t xml:space="preserve"> }</w:t>
-      </w:r>
-      <w:proofErr w:type="gramEnd"/>
-      <w:r>
-        <w:rPr>
-          <w:rFonts w:ascii="Arial" w:eastAsia="Batang" w:hAnsi="Arial" w:cs="Arial"/>
-          <w:b/>
-          <w:bCs/>
-          <w:sz w:val="14"/>
-          <w:szCs w:val="14"/>
-          <w:lang w:val="es-MX"/>
-        </w:rPr>
-        <w:t>}</w:t>
+        <w:t>{{ datos_inmueble }}</w:t>
       </w:r>
       <w:r>
         <w:rPr>
@@ -2651,9 +2425,8 @@
           <w:szCs w:val="14"/>
           <w:lang w:val="es-ES"/>
         </w:rPr>
-        <w:t xml:space="preserve">e </w:t>
-      </w:r>
-      <w:proofErr w:type="gramStart"/>
+        <w:t>e {{ oficina_registral }}</w:t>
+      </w:r>
       <w:r>
         <w:rPr>
           <w:rFonts w:ascii="Arial" w:hAnsi="Arial" w:cs="Arial"/>
@@ -2661,86 +2434,7 @@
           <w:szCs w:val="14"/>
           <w:lang w:val="es-ES"/>
         </w:rPr>
-        <w:t xml:space="preserve">{{ </w:t>
-      </w:r>
-      <w:proofErr w:type="spellStart"/>
-      <w:r>
-        <w:rPr>
-          <w:rFonts w:ascii="Arial" w:hAnsi="Arial" w:cs="Arial"/>
-          <w:sz w:val="14"/>
-          <w:szCs w:val="14"/>
-          <w:lang w:val="es-ES"/>
-        </w:rPr>
-        <w:t>oficina</w:t>
-      </w:r>
-      <w:proofErr w:type="gramEnd"/>
-      <w:r>
-        <w:rPr>
-          <w:rFonts w:ascii="Arial" w:hAnsi="Arial" w:cs="Arial"/>
-          <w:sz w:val="14"/>
-          <w:szCs w:val="14"/>
-          <w:lang w:val="es-ES"/>
-        </w:rPr>
-        <w:t>_</w:t>
-      </w:r>
-      <w:proofErr w:type="gramStart"/>
-      <w:r>
-        <w:rPr>
-          <w:rFonts w:ascii="Arial" w:hAnsi="Arial" w:cs="Arial"/>
-          <w:sz w:val="14"/>
-          <w:szCs w:val="14"/>
-          <w:lang w:val="es-ES"/>
-        </w:rPr>
-        <w:t>registral</w:t>
-      </w:r>
-      <w:proofErr w:type="spellEnd"/>
-      <w:r>
-        <w:rPr>
-          <w:rFonts w:ascii="Arial" w:hAnsi="Arial" w:cs="Arial"/>
-          <w:sz w:val="14"/>
-          <w:szCs w:val="14"/>
-          <w:lang w:val="es-ES"/>
-        </w:rPr>
-        <w:t xml:space="preserve"> }</w:t>
-      </w:r>
-      <w:proofErr w:type="gramEnd"/>
-      <w:r>
-        <w:rPr>
-          <w:rFonts w:ascii="Arial" w:hAnsi="Arial" w:cs="Arial"/>
-          <w:sz w:val="14"/>
-          <w:szCs w:val="14"/>
-          <w:lang w:val="es-ES"/>
-        </w:rPr>
-        <w:t>}</w:t>
-      </w:r>
-      <w:r>
-        <w:rPr>
-          <w:rFonts w:ascii="Arial" w:hAnsi="Arial" w:cs="Arial"/>
-          <w:sz w:val="14"/>
-          <w:szCs w:val="14"/>
-          <w:lang w:val="es-ES"/>
-        </w:rPr>
-        <w:t xml:space="preserve">, en el libro primero, sección primera, volumen número   y bajo la partida número    </w:t>
-      </w:r>
-      <w:proofErr w:type="gramStart"/>
-      <w:r>
-        <w:rPr>
-          <w:rFonts w:ascii="Arial" w:hAnsi="Arial" w:cs="Arial"/>
-          <w:sz w:val="14"/>
-          <w:szCs w:val="14"/>
-          <w:lang w:val="es-ES"/>
-        </w:rPr>
-        <w:t xml:space="preserve">  ,</w:t>
-      </w:r>
-      <w:proofErr w:type="gramEnd"/>
-      <w:r>
-        <w:rPr>
-          <w:rFonts w:ascii="Arial" w:hAnsi="Arial" w:cs="Arial"/>
-          <w:sz w:val="14"/>
-          <w:szCs w:val="14"/>
-          <w:lang w:val="es-ES"/>
-        </w:rPr>
-        <w:t xml:space="preserve"> en el libro segundo, sección primera, volumen número  </w:t>
+        <w:t xml:space="preserve">, en el libro primero, sección primera, volumen número   y bajo la partida número      , en el libro segundo, sección primera, volumen número  </w:t>
       </w:r>
     </w:p>
     <w:p>
@@ -2870,79 +2564,7 @@
           <w:szCs w:val="14"/>
           <w:lang w:val="es-MX"/>
         </w:rPr>
-        <w:t>“</w:t>
-      </w:r>
-      <w:proofErr w:type="gramStart"/>
-      <w:r>
-        <w:rPr>
-          <w:rFonts w:ascii="Arial" w:hAnsi="Arial" w:cs="Arial"/>
-          <w:b/>
-          <w:bCs/>
-          <w:sz w:val="14"/>
-          <w:szCs w:val="14"/>
-          <w:lang w:val="es-MX"/>
-        </w:rPr>
-        <w:t xml:space="preserve">{{ </w:t>
-      </w:r>
-      <w:proofErr w:type="spellStart"/>
-      <w:r>
-        <w:rPr>
-          <w:rFonts w:ascii="Arial" w:hAnsi="Arial" w:cs="Arial"/>
-          <w:b/>
-          <w:bCs/>
-          <w:sz w:val="14"/>
-          <w:szCs w:val="14"/>
-          <w:lang w:val="es-MX"/>
-        </w:rPr>
-        <w:t>folio</w:t>
-      </w:r>
-      <w:proofErr w:type="gramEnd"/>
-      <w:r>
-        <w:rPr>
-          <w:rFonts w:ascii="Arial" w:hAnsi="Arial" w:cs="Arial"/>
-          <w:b/>
-          <w:bCs/>
-          <w:sz w:val="14"/>
-          <w:szCs w:val="14"/>
-          <w:lang w:val="es-MX"/>
-        </w:rPr>
-        <w:t>_</w:t>
-      </w:r>
-      <w:proofErr w:type="gramStart"/>
-      <w:r>
-        <w:rPr>
-          <w:rFonts w:ascii="Arial" w:hAnsi="Arial" w:cs="Arial"/>
-          <w:b/>
-          <w:bCs/>
-          <w:sz w:val="14"/>
-          <w:szCs w:val="14"/>
-          <w:lang w:val="es-MX"/>
-        </w:rPr>
-        <w:t>real</w:t>
-      </w:r>
-      <w:proofErr w:type="spellEnd"/>
-      <w:r>
-        <w:rPr>
-          <w:rFonts w:ascii="Arial" w:hAnsi="Arial" w:cs="Arial"/>
-          <w:b/>
-          <w:bCs/>
-          <w:sz w:val="14"/>
-          <w:szCs w:val="14"/>
-          <w:lang w:val="es-MX"/>
-        </w:rPr>
-        <w:t xml:space="preserve"> }</w:t>
-      </w:r>
-      <w:proofErr w:type="gramEnd"/>
-      <w:r>
-        <w:rPr>
-          <w:rFonts w:ascii="Arial" w:hAnsi="Arial" w:cs="Arial"/>
-          <w:b/>
-          <w:bCs/>
-          <w:sz w:val="14"/>
-          <w:szCs w:val="14"/>
-          <w:lang w:val="es-MX"/>
-        </w:rPr>
-        <w:t>}”</w:t>
+        <w:t>“{{ folio_real }}”</w:t>
       </w:r>
       <w:r>
         <w:rPr>
@@ -3021,7 +2643,6 @@
         </w:rPr>
         <w:t xml:space="preserve">a </w:t>
       </w:r>
-      <w:proofErr w:type="gramStart"/>
       <w:r>
         <w:rPr>
           <w:rFonts w:ascii="Arial" w:hAnsi="Arial" w:cs="Arial"/>
@@ -3030,50 +2651,21 @@
         </w:rPr>
         <w:t xml:space="preserve">{{ </w:t>
       </w:r>
-      <w:proofErr w:type="spellStart"/>
-      <w:r>
-        <w:rPr>
-          <w:rFonts w:ascii="Arial" w:hAnsi="Arial" w:cs="Arial"/>
-          <w:sz w:val="14"/>
-          <w:szCs w:val="14"/>
-        </w:rPr>
-        <w:t>fecha</w:t>
-      </w:r>
-      <w:proofErr w:type="gramEnd"/>
-      <w:r>
-        <w:rPr>
-          <w:rFonts w:ascii="Arial" w:hAnsi="Arial" w:cs="Arial"/>
-          <w:sz w:val="14"/>
-          <w:szCs w:val="14"/>
-        </w:rPr>
-        <w:t>_</w:t>
-      </w:r>
-      <w:proofErr w:type="gramStart"/>
-      <w:r>
-        <w:rPr>
-          <w:rFonts w:ascii="Arial" w:hAnsi="Arial" w:cs="Arial"/>
-          <w:sz w:val="14"/>
-          <w:szCs w:val="14"/>
-        </w:rPr>
-        <w:t>expedicion</w:t>
-      </w:r>
-      <w:proofErr w:type="spellEnd"/>
-      <w:r>
-        <w:rPr>
-          <w:rFonts w:ascii="Arial" w:hAnsi="Arial" w:cs="Arial"/>
-          <w:sz w:val="14"/>
-          <w:szCs w:val="14"/>
-        </w:rPr>
-        <w:t xml:space="preserve"> }</w:t>
-      </w:r>
-      <w:proofErr w:type="gramEnd"/>
-      <w:r>
-        <w:rPr>
-          <w:rFonts w:ascii="Arial" w:hAnsi="Arial" w:cs="Arial"/>
-          <w:sz w:val="14"/>
-          <w:szCs w:val="14"/>
-        </w:rPr>
-        <w:t>}</w:t>
+      <w:r>
+        <w:rPr>
+          <w:rFonts w:ascii="Arial" w:hAnsi="Arial" w:cs="Arial"/>
+          <w:sz w:val="14"/>
+          <w:szCs w:val="14"/>
+        </w:rPr>
+        <w:t>fecha_expedicion</w:t>
+      </w:r>
+      <w:r>
+        <w:rPr>
+          <w:rFonts w:ascii="Arial" w:hAnsi="Arial" w:cs="Arial"/>
+          <w:sz w:val="14"/>
+          <w:szCs w:val="14"/>
+        </w:rPr>
+        <w:t xml:space="preserve"> }}</w:t>
       </w:r>
       <w:r>
         <w:rPr>
@@ -3126,71 +2718,15 @@
         <w:t xml:space="preserve"> </w:t>
       </w:r>
       <w:bookmarkEnd w:id="5"/>
-      <w:proofErr w:type="gramStart"/>
-      <w:r>
-        <w:rPr>
-          <w:rFonts w:ascii="Arial" w:hAnsi="Arial" w:cs="Arial"/>
-          <w:b/>
-          <w:bCs/>
-          <w:sz w:val="14"/>
-          <w:szCs w:val="14"/>
-        </w:rPr>
-        <w:t xml:space="preserve">{{ </w:t>
-      </w:r>
-      <w:proofErr w:type="spellStart"/>
-      <w:r>
-        <w:rPr>
-          <w:rFonts w:ascii="Arial" w:hAnsi="Arial" w:cs="Arial"/>
-          <w:b/>
-          <w:bCs/>
-          <w:sz w:val="14"/>
-          <w:szCs w:val="14"/>
-        </w:rPr>
-        <w:t>numero</w:t>
-      </w:r>
-      <w:proofErr w:type="gramEnd"/>
-      <w:r>
-        <w:rPr>
-          <w:rFonts w:ascii="Arial" w:hAnsi="Arial" w:cs="Arial"/>
-          <w:b/>
-          <w:bCs/>
-          <w:sz w:val="14"/>
-          <w:szCs w:val="14"/>
-        </w:rPr>
-        <w:t>_</w:t>
-      </w:r>
-      <w:proofErr w:type="gramStart"/>
-      <w:r>
-        <w:rPr>
-          <w:rFonts w:ascii="Arial" w:hAnsi="Arial" w:cs="Arial"/>
-          <w:b/>
-          <w:bCs/>
-          <w:sz w:val="14"/>
-          <w:szCs w:val="14"/>
-        </w:rPr>
-        <w:t>carta</w:t>
-      </w:r>
-      <w:proofErr w:type="spellEnd"/>
-      <w:r>
-        <w:rPr>
-          <w:rFonts w:ascii="Arial" w:hAnsi="Arial" w:cs="Arial"/>
-          <w:b/>
-          <w:bCs/>
-          <w:sz w:val="14"/>
-          <w:szCs w:val="14"/>
-        </w:rPr>
-        <w:t xml:space="preserve"> }</w:t>
-      </w:r>
-      <w:proofErr w:type="gramEnd"/>
-      <w:r>
-        <w:rPr>
-          <w:rFonts w:ascii="Arial" w:hAnsi="Arial" w:cs="Arial"/>
-          <w:b/>
-          <w:bCs/>
-          <w:sz w:val="14"/>
-          <w:szCs w:val="14"/>
-        </w:rPr>
-        <w:t>}</w:t>
+      <w:r>
+        <w:rPr>
+          <w:rFonts w:ascii="Arial" w:hAnsi="Arial" w:cs="Arial"/>
+          <w:b/>
+          <w:bCs/>
+          <w:sz w:val="14"/>
+          <w:szCs w:val="14"/>
+        </w:rPr>
+        <w:t>{{ numero_carta }}</w:t>
       </w:r>
       <w:r>
         <w:rPr>
@@ -3348,71 +2884,15 @@
         </w:rPr>
         <w:t xml:space="preserve"> </w:t>
       </w:r>
-      <w:proofErr w:type="gramStart"/>
-      <w:r>
-        <w:rPr>
-          <w:rFonts w:ascii="Arial" w:hAnsi="Arial" w:cs="Arial"/>
-          <w:b/>
-          <w:bCs/>
-          <w:sz w:val="14"/>
-          <w:szCs w:val="14"/>
-        </w:rPr>
-        <w:t xml:space="preserve">{{ </w:t>
-      </w:r>
-      <w:proofErr w:type="spellStart"/>
-      <w:r>
-        <w:rPr>
-          <w:rFonts w:ascii="Arial" w:hAnsi="Arial" w:cs="Arial"/>
-          <w:b/>
-          <w:bCs/>
-          <w:sz w:val="14"/>
-          <w:szCs w:val="14"/>
-        </w:rPr>
-        <w:t>fecha</w:t>
-      </w:r>
-      <w:proofErr w:type="gramEnd"/>
-      <w:r>
-        <w:rPr>
-          <w:rFonts w:ascii="Arial" w:hAnsi="Arial" w:cs="Arial"/>
-          <w:b/>
-          <w:bCs/>
-          <w:sz w:val="14"/>
-          <w:szCs w:val="14"/>
-        </w:rPr>
-        <w:t>_</w:t>
-      </w:r>
-      <w:proofErr w:type="gramStart"/>
-      <w:r>
-        <w:rPr>
-          <w:rFonts w:ascii="Arial" w:hAnsi="Arial" w:cs="Arial"/>
-          <w:b/>
-          <w:bCs/>
-          <w:sz w:val="14"/>
-          <w:szCs w:val="14"/>
-        </w:rPr>
-        <w:t>liquidacion</w:t>
-      </w:r>
-      <w:proofErr w:type="spellEnd"/>
-      <w:r>
-        <w:rPr>
-          <w:rFonts w:ascii="Arial" w:hAnsi="Arial" w:cs="Arial"/>
-          <w:b/>
-          <w:bCs/>
-          <w:sz w:val="14"/>
-          <w:szCs w:val="14"/>
-        </w:rPr>
-        <w:t xml:space="preserve"> }</w:t>
-      </w:r>
-      <w:proofErr w:type="gramEnd"/>
-      <w:r>
-        <w:rPr>
-          <w:rFonts w:ascii="Arial" w:hAnsi="Arial" w:cs="Arial"/>
-          <w:b/>
-          <w:bCs/>
-          <w:sz w:val="14"/>
-          <w:szCs w:val="14"/>
-        </w:rPr>
-        <w:t>}</w:t>
+      <w:r>
+        <w:rPr>
+          <w:rFonts w:ascii="Arial" w:hAnsi="Arial" w:cs="Arial"/>
+          <w:b/>
+          <w:bCs/>
+          <w:sz w:val="14"/>
+          <w:szCs w:val="14"/>
+        </w:rPr>
+        <w:t>{{ fecha_liquidacion }}</w:t>
       </w:r>
     </w:p>
     <w:p>
@@ -4032,7 +3512,6 @@
         </w:rPr>
         <w:t xml:space="preserve"> </w:t>
       </w:r>
-      <w:proofErr w:type="spellStart"/>
       <w:r>
         <w:rPr>
           <w:rFonts w:ascii="Arial" w:hAnsi="Arial" w:cs="Arial"/>
@@ -4041,18 +3520,7 @@
           <w:szCs w:val="14"/>
           <w:lang w:val="es-MX"/>
         </w:rPr>
-        <w:t>numero_credito</w:t>
-      </w:r>
-      <w:proofErr w:type="spellEnd"/>
-      <w:r>
-        <w:rPr>
-          <w:rFonts w:ascii="Arial" w:hAnsi="Arial" w:cs="Arial"/>
-          <w:b/>
-          <w:sz w:val="14"/>
-          <w:szCs w:val="14"/>
-          <w:lang w:val="es-MX"/>
-        </w:rPr>
-        <w:t xml:space="preserve"> }}</w:t>
+        <w:t>numero_credito }}</w:t>
       </w:r>
       <w:r>
         <w:rPr>
@@ -5208,43 +4676,7 @@
           <w:sz w:val="14"/>
           <w:szCs w:val="14"/>
         </w:rPr>
-        <w:t xml:space="preserve"> hija de padres mexicanos, originaria de </w:t>
-      </w:r>
-      <w:proofErr w:type="spellStart"/>
-      <w:r>
-        <w:rPr>
-          <w:rFonts w:ascii="Arial" w:hAnsi="Arial" w:cs="Arial"/>
-          <w:sz w:val="14"/>
-          <w:szCs w:val="14"/>
-        </w:rPr>
-        <w:t>Ahuazotepec</w:t>
-      </w:r>
-      <w:proofErr w:type="spellEnd"/>
-      <w:r>
-        <w:rPr>
-          <w:rFonts w:ascii="Arial" w:hAnsi="Arial" w:cs="Arial"/>
-          <w:sz w:val="14"/>
-          <w:szCs w:val="14"/>
-        </w:rPr>
-        <w:t xml:space="preserve">, Estado de Puebla, donde nació el día veintiuno del mes de marzo del año mil novecientos setenta y tres, soltera, Maestra en Derecho, con domicilio en Avenida Barranca del Muerto número doscientos ochenta, colonia Guadalupe Inn, Alcaldía Álvaro Obregón, Ciudad de México, código postal cero mil veinte; con Clave Única de Registro de Población: “HECB730321MPLRRN05” (HECB siete tres cero tres dos uno MPLRRN cero cinco) y Registro Federal de Contribuyentes: “HECB7303211C4” (HECB siete tres cero tres dos uno </w:t>
-      </w:r>
-      <w:proofErr w:type="spellStart"/>
-      <w:r>
-        <w:rPr>
-          <w:rFonts w:ascii="Arial" w:hAnsi="Arial" w:cs="Arial"/>
-          <w:sz w:val="14"/>
-          <w:szCs w:val="14"/>
-        </w:rPr>
-        <w:t>uno</w:t>
-      </w:r>
-      <w:proofErr w:type="spellEnd"/>
-      <w:r>
-        <w:rPr>
-          <w:rFonts w:ascii="Arial" w:hAnsi="Arial" w:cs="Arial"/>
-          <w:sz w:val="14"/>
-          <w:szCs w:val="14"/>
-        </w:rPr>
-        <w:t xml:space="preserve"> C cuatro).</w:t>
+        <w:t xml:space="preserve"> hija de padres mexicanos, originaria de Ahuazotepec, Estado de Puebla, donde nació el día veintiuno del mes de marzo del año mil novecientos setenta y tres, soltera, Maestra en Derecho, con domicilio en Avenida Barranca del Muerto número doscientos ochenta, colonia Guadalupe Inn, Alcaldía Álvaro Obregón, Ciudad de México, código postal cero mil veinte; con Clave Única de Registro de Población: “HECB730321MPLRRN05” (HECB siete tres cero tres dos uno MPLRRN cero cinco) y Registro Federal de Contribuyentes: “HECB7303211C4” (HECB siete tres cero tres dos uno uno C cuatro).</w:t>
       </w:r>
       <w:r>
         <w:rPr>
@@ -5650,7 +5082,6 @@
         </w:rPr>
         <w:t xml:space="preserve">-------- </w:t>
       </w:r>
-      <w:proofErr w:type="gramStart"/>
       <w:r>
         <w:rPr>
           <w:rFonts w:ascii="Arial" w:eastAsia="MS Mincho" w:hAnsi="Arial" w:cs="Arial"/>
@@ -5658,17 +5089,7 @@
           <w:szCs w:val="14"/>
           <w:lang w:val="es-MX"/>
         </w:rPr>
-        <w:t>VI.-</w:t>
-      </w:r>
-      <w:proofErr w:type="gramEnd"/>
-      <w:r>
-        <w:rPr>
-          <w:rFonts w:ascii="Arial" w:eastAsia="MS Mincho" w:hAnsi="Arial" w:cs="Arial"/>
-          <w:sz w:val="14"/>
-          <w:szCs w:val="14"/>
-          <w:lang w:val="es-MX"/>
-        </w:rPr>
-        <w:t xml:space="preserve"> Que leí este instrumento a la compareciente, a quien le expliqué su valor, fuerza y las consecuencias legales de su contenido, manifestando su conformidad con el mismo, por lo que lo otorga, ratifica y </w:t>
+        <w:t xml:space="preserve">VI.- Que leí este instrumento a la compareciente, a quien le expliqué su valor, fuerza y las consecuencias legales de su contenido, manifestando su conformidad con el mismo, por lo que lo otorga, ratifica y </w:t>
       </w:r>
       <w:r>
         <w:rPr>
@@ -6644,7 +6065,6 @@
         </w:rPr>
         <w:t xml:space="preserve"> </w:t>
       </w:r>
-      <w:proofErr w:type="gramStart"/>
       <w:r>
         <w:rPr>
           <w:rFonts w:ascii="Arial" w:hAnsi="Arial" w:cs="Arial"/>
@@ -6653,62 +6073,7 @@
           <w:szCs w:val="14"/>
           <w:u w:val="single"/>
         </w:rPr>
-        <w:t xml:space="preserve">{{ </w:t>
-      </w:r>
-      <w:proofErr w:type="spellStart"/>
-      <w:r>
-        <w:rPr>
-          <w:rFonts w:ascii="Arial" w:hAnsi="Arial" w:cs="Arial"/>
-          <w:b/>
-          <w:sz w:val="14"/>
-          <w:szCs w:val="14"/>
-          <w:u w:val="single"/>
-        </w:rPr>
-        <w:t>nombre</w:t>
-      </w:r>
-      <w:proofErr w:type="gramEnd"/>
-      <w:r>
-        <w:rPr>
-          <w:rFonts w:ascii="Arial" w:hAnsi="Arial" w:cs="Arial"/>
-          <w:b/>
-          <w:sz w:val="14"/>
-          <w:szCs w:val="14"/>
-          <w:u w:val="single"/>
-        </w:rPr>
-        <w:t>_</w:t>
-      </w:r>
-      <w:proofErr w:type="gramStart"/>
-      <w:r>
-        <w:rPr>
-          <w:rFonts w:ascii="Arial" w:hAnsi="Arial" w:cs="Arial"/>
-          <w:b/>
-          <w:sz w:val="14"/>
-          <w:szCs w:val="14"/>
-          <w:u w:val="single"/>
-        </w:rPr>
-        <w:t>acreditado</w:t>
-      </w:r>
-      <w:proofErr w:type="spellEnd"/>
-      <w:r>
-        <w:rPr>
-          <w:rFonts w:ascii="Arial" w:hAnsi="Arial" w:cs="Arial"/>
-          <w:b/>
-          <w:sz w:val="14"/>
-          <w:szCs w:val="14"/>
-          <w:u w:val="single"/>
-        </w:rPr>
-        <w:t xml:space="preserve"> }</w:t>
-      </w:r>
-      <w:proofErr w:type="gramEnd"/>
-      <w:r>
-        <w:rPr>
-          <w:rFonts w:ascii="Arial" w:hAnsi="Arial" w:cs="Arial"/>
-          <w:b/>
-          <w:sz w:val="14"/>
-          <w:szCs w:val="14"/>
-          <w:u w:val="single"/>
-        </w:rPr>
-        <w:t>}</w:t>
+        <w:t>{{ nombre_acreditado }}</w:t>
       </w:r>
       <w:r>
         <w:rPr>

</xml_diff>